<commit_message>
SE actualiza documento para que tenga la url del repo
</commit_message>
<xml_diff>
--- a/Documento de AnteProyecto.docx
+++ b/Documento de AnteProyecto.docx
@@ -729,6 +729,7 @@
           <w:rFonts w:ascii="Times New Roman" w:eastAsia="Calibri" w:hAnsi="Times New Roman" w:cs="Times New Roman"/>
           <w:sz w:val="19"/>
           <w:szCs w:val="19"/>
+          <w:u w:val="single"/>
         </w:rPr>
       </w:pPr>
       <w:r>
@@ -737,7 +738,15 @@
           <w:sz w:val="19"/>
           <w:szCs w:val="19"/>
         </w:rPr>
-        <w:t xml:space="preserve">Nota: por el peso del proyecto este se ha alojado en un archivo comprimido 7z en drive. </w:t>
+        <w:t xml:space="preserve">Nota: por el peso del proyecto este se ha alojado en </w:t>
+      </w:r>
+      <w:r>
+        <w:rPr>
+          <w:rFonts w:ascii="Times New Roman" w:eastAsia="Calibri" w:hAnsi="Times New Roman" w:cs="Times New Roman"/>
+          <w:sz w:val="19"/>
+          <w:szCs w:val="19"/>
+        </w:rPr>
+        <w:t>github</w:t>
       </w:r>
     </w:p>
     <w:p>
@@ -2325,47 +2334,7 @@
           <w:szCs w:val="22"/>
           <w:lang w:val="es-ES"/>
         </w:rPr>
-        <w:t xml:space="preserve">Utilizaremos los datos públicos de </w:t>
-      </w:r>
-      <w:proofErr w:type="spellStart"/>
-      <w:r>
-        <w:rPr>
-          <w:rFonts w:ascii="Times New Roman" w:hAnsi="Times New Roman" w:cs="Times New Roman"/>
-          <w:sz w:val="22"/>
-          <w:szCs w:val="22"/>
-          <w:lang w:val="es-ES"/>
-        </w:rPr>
-        <w:t>Olist</w:t>
-      </w:r>
-      <w:proofErr w:type="spellEnd"/>
-      <w:r>
-        <w:rPr>
-          <w:rFonts w:ascii="Times New Roman" w:hAnsi="Times New Roman" w:cs="Times New Roman"/>
-          <w:sz w:val="22"/>
-          <w:szCs w:val="22"/>
-          <w:lang w:val="es-ES"/>
-        </w:rPr>
-        <w:t xml:space="preserve"> disponibles en </w:t>
-      </w:r>
-      <w:proofErr w:type="spellStart"/>
-      <w:r>
-        <w:rPr>
-          <w:rFonts w:ascii="Times New Roman" w:hAnsi="Times New Roman" w:cs="Times New Roman"/>
-          <w:sz w:val="22"/>
-          <w:szCs w:val="22"/>
-          <w:lang w:val="es-ES"/>
-        </w:rPr>
-        <w:t>Kaggle</w:t>
-      </w:r>
-      <w:proofErr w:type="spellEnd"/>
-      <w:r>
-        <w:rPr>
-          <w:rFonts w:ascii="Times New Roman" w:hAnsi="Times New Roman" w:cs="Times New Roman"/>
-          <w:sz w:val="22"/>
-          <w:szCs w:val="22"/>
-          <w:lang w:val="es-ES"/>
-        </w:rPr>
-        <w:t>. Esta información está organizada en archivos CSV que cubren diferentes aspectos del negocio:</w:t>
+        <w:t>Utilizaremos los datos públicos de Olist disponibles en Kaggle. Esta información está organizada en archivos CSV que cubren diferentes aspectos del negocio:</w:t>
       </w:r>
     </w:p>
     <w:p>
@@ -2970,7 +2939,6 @@
           <w:lang w:val="es-ES"/>
         </w:rPr>
       </w:pPr>
-      <w:proofErr w:type="spellStart"/>
       <w:r>
         <w:rPr>
           <w:rFonts w:ascii="Times New Roman" w:hAnsi="Times New Roman" w:cs="Times New Roman"/>
@@ -2980,30 +2948,17 @@
           <w:szCs w:val="22"/>
           <w:lang w:val="es-ES"/>
         </w:rPr>
-        <w:t>Fact_Ventas_y_Logistica</w:t>
-      </w:r>
-      <w:proofErr w:type="spellEnd"/>
-      <w:r>
-        <w:rPr>
-          <w:rFonts w:ascii="Times New Roman" w:hAnsi="Times New Roman" w:cs="Times New Roman"/>
-          <w:b/>
-          <w:bCs/>
+        <w:t>Fact_Ventas_y_Logistica:</w:t>
+      </w:r>
+      <w:r>
+        <w:rPr>
+          <w:rFonts w:ascii="Times New Roman" w:hAnsi="Times New Roman" w:cs="Times New Roman"/>
           <w:sz w:val="22"/>
           <w:szCs w:val="22"/>
           <w:lang w:val="es-ES"/>
         </w:rPr>
-        <w:t>:</w:t>
-      </w:r>
-      <w:r>
-        <w:rPr>
-          <w:rFonts w:ascii="Times New Roman" w:hAnsi="Times New Roman" w:cs="Times New Roman"/>
-          <w:sz w:val="22"/>
-          <w:szCs w:val="22"/>
-          <w:lang w:val="es-ES"/>
-        </w:rPr>
         <w:t xml:space="preserve"> Almacena la granularidad por línea de detalle de orden. Contiene las llaves foráneas y métricas calculadas como: </w:t>
       </w:r>
-      <w:proofErr w:type="spellStart"/>
       <w:r>
         <w:rPr>
           <w:rFonts w:ascii="Times New Roman" w:hAnsi="Times New Roman" w:cs="Times New Roman"/>
@@ -3015,7 +2970,6 @@
         </w:rPr>
         <w:t>Precio_Producto</w:t>
       </w:r>
-      <w:proofErr w:type="spellEnd"/>
       <w:r>
         <w:rPr>
           <w:rFonts w:ascii="Times New Roman" w:hAnsi="Times New Roman" w:cs="Times New Roman"/>
@@ -3025,7 +2979,6 @@
         </w:rPr>
         <w:t xml:space="preserve">, </w:t>
       </w:r>
-      <w:proofErr w:type="spellStart"/>
       <w:r>
         <w:rPr>
           <w:rFonts w:ascii="Times New Roman" w:hAnsi="Times New Roman" w:cs="Times New Roman"/>
@@ -3037,7 +2990,6 @@
         </w:rPr>
         <w:t>Valor_Flete</w:t>
       </w:r>
-      <w:proofErr w:type="spellEnd"/>
       <w:r>
         <w:rPr>
           <w:rFonts w:ascii="Times New Roman" w:hAnsi="Times New Roman" w:cs="Times New Roman"/>
@@ -3047,7 +2999,6 @@
         </w:rPr>
         <w:t xml:space="preserve">, </w:t>
       </w:r>
-      <w:proofErr w:type="spellStart"/>
       <w:r>
         <w:rPr>
           <w:rFonts w:ascii="Times New Roman" w:hAnsi="Times New Roman" w:cs="Times New Roman"/>
@@ -3059,7 +3010,6 @@
         </w:rPr>
         <w:t>Monto_Total_Linea</w:t>
       </w:r>
-      <w:proofErr w:type="spellEnd"/>
       <w:r>
         <w:rPr>
           <w:rFonts w:ascii="Times New Roman" w:hAnsi="Times New Roman" w:cs="Times New Roman"/>
@@ -3069,7 +3019,6 @@
         </w:rPr>
         <w:t xml:space="preserve">, </w:t>
       </w:r>
-      <w:proofErr w:type="spellStart"/>
       <w:r>
         <w:rPr>
           <w:rFonts w:ascii="Times New Roman" w:hAnsi="Times New Roman" w:cs="Times New Roman"/>
@@ -3081,7 +3030,6 @@
         </w:rPr>
         <w:t>Dias_Despacho_Vendedor</w:t>
       </w:r>
-      <w:proofErr w:type="spellEnd"/>
       <w:r>
         <w:rPr>
           <w:rFonts w:ascii="Times New Roman" w:hAnsi="Times New Roman" w:cs="Times New Roman"/>
@@ -3091,7 +3039,6 @@
         </w:rPr>
         <w:t xml:space="preserve">, </w:t>
       </w:r>
-      <w:proofErr w:type="spellStart"/>
       <w:r>
         <w:rPr>
           <w:rFonts w:ascii="Times New Roman" w:hAnsi="Times New Roman" w:cs="Times New Roman"/>
@@ -3103,7 +3050,6 @@
         </w:rPr>
         <w:t>Dias_Total_Entrega</w:t>
       </w:r>
-      <w:proofErr w:type="spellEnd"/>
       <w:r>
         <w:rPr>
           <w:rFonts w:ascii="Times New Roman" w:hAnsi="Times New Roman" w:cs="Times New Roman"/>
@@ -3113,7 +3059,6 @@
         </w:rPr>
         <w:t xml:space="preserve"> y el indicador </w:t>
       </w:r>
-      <w:proofErr w:type="spellStart"/>
       <w:r>
         <w:rPr>
           <w:rFonts w:ascii="Times New Roman" w:hAnsi="Times New Roman" w:cs="Times New Roman"/>
@@ -3125,7 +3070,6 @@
         </w:rPr>
         <w:t>Es_Entrega_Tardia</w:t>
       </w:r>
-      <w:proofErr w:type="spellEnd"/>
       <w:r>
         <w:rPr>
           <w:rFonts w:ascii="Times New Roman" w:hAnsi="Times New Roman" w:cs="Times New Roman"/>
@@ -3189,7 +3133,6 @@
           <w:lang w:val="es-ES"/>
         </w:rPr>
       </w:pPr>
-      <w:proofErr w:type="spellStart"/>
       <w:r>
         <w:rPr>
           <w:rFonts w:ascii="Times New Roman" w:hAnsi="Times New Roman" w:cs="Times New Roman"/>
@@ -3199,19 +3142,7 @@
           <w:szCs w:val="22"/>
           <w:lang w:val="es-ES"/>
         </w:rPr>
-        <w:t>Dim_Cliente</w:t>
-      </w:r>
-      <w:proofErr w:type="spellEnd"/>
-      <w:r>
-        <w:rPr>
-          <w:rFonts w:ascii="Times New Roman" w:hAnsi="Times New Roman" w:cs="Times New Roman"/>
-          <w:b/>
-          <w:bCs/>
-          <w:sz w:val="22"/>
-          <w:szCs w:val="22"/>
-          <w:lang w:val="es-ES"/>
-        </w:rPr>
-        <w:t>:</w:t>
+        <w:t>Dim_Cliente:</w:t>
       </w:r>
       <w:r>
         <w:rPr>
@@ -3236,7 +3167,6 @@
           <w:lang w:val="es-ES"/>
         </w:rPr>
       </w:pPr>
-      <w:proofErr w:type="spellStart"/>
       <w:r>
         <w:rPr>
           <w:rFonts w:ascii="Times New Roman" w:hAnsi="Times New Roman" w:cs="Times New Roman"/>
@@ -3246,19 +3176,7 @@
           <w:szCs w:val="22"/>
           <w:lang w:val="es-ES"/>
         </w:rPr>
-        <w:t>Dim_Vendedor</w:t>
-      </w:r>
-      <w:proofErr w:type="spellEnd"/>
-      <w:r>
-        <w:rPr>
-          <w:rFonts w:ascii="Times New Roman" w:hAnsi="Times New Roman" w:cs="Times New Roman"/>
-          <w:b/>
-          <w:bCs/>
-          <w:sz w:val="22"/>
-          <w:szCs w:val="22"/>
-          <w:lang w:val="es-ES"/>
-        </w:rPr>
-        <w:t>:</w:t>
+        <w:t>Dim_Vendedor:</w:t>
       </w:r>
       <w:r>
         <w:rPr>
@@ -3283,7 +3201,6 @@
           <w:lang w:val="es-ES"/>
         </w:rPr>
       </w:pPr>
-      <w:proofErr w:type="spellStart"/>
       <w:r>
         <w:rPr>
           <w:rFonts w:ascii="Times New Roman" w:hAnsi="Times New Roman" w:cs="Times New Roman"/>
@@ -3293,19 +3210,7 @@
           <w:szCs w:val="22"/>
           <w:lang w:val="es-ES"/>
         </w:rPr>
-        <w:t>Dim_Producto</w:t>
-      </w:r>
-      <w:proofErr w:type="spellEnd"/>
-      <w:r>
-        <w:rPr>
-          <w:rFonts w:ascii="Times New Roman" w:hAnsi="Times New Roman" w:cs="Times New Roman"/>
-          <w:b/>
-          <w:bCs/>
-          <w:sz w:val="22"/>
-          <w:szCs w:val="22"/>
-          <w:lang w:val="es-ES"/>
-        </w:rPr>
-        <w:t>:</w:t>
+        <w:t>Dim_Producto:</w:t>
       </w:r>
       <w:r>
         <w:rPr>
@@ -3330,7 +3235,6 @@
           <w:lang w:val="es-ES"/>
         </w:rPr>
       </w:pPr>
-      <w:proofErr w:type="spellStart"/>
       <w:r>
         <w:rPr>
           <w:rFonts w:ascii="Times New Roman" w:hAnsi="Times New Roman" w:cs="Times New Roman"/>
@@ -3340,19 +3244,7 @@
           <w:szCs w:val="22"/>
           <w:lang w:val="es-ES"/>
         </w:rPr>
-        <w:t>Dim_Tiempo</w:t>
-      </w:r>
-      <w:proofErr w:type="spellEnd"/>
-      <w:r>
-        <w:rPr>
-          <w:rFonts w:ascii="Times New Roman" w:hAnsi="Times New Roman" w:cs="Times New Roman"/>
-          <w:b/>
-          <w:bCs/>
-          <w:sz w:val="22"/>
-          <w:szCs w:val="22"/>
-          <w:lang w:val="es-ES"/>
-        </w:rPr>
-        <w:t>:</w:t>
+        <w:t>Dim_Tiempo:</w:t>
       </w:r>
       <w:r>
         <w:rPr>
@@ -3498,19 +3390,8 @@
           <w:szCs w:val="22"/>
           <w:lang w:val="es-SV"/>
         </w:rPr>
-        <w:t xml:space="preserve">Fuente: </w:t>
-      </w:r>
-      <w:proofErr w:type="spellStart"/>
-      <w:r>
-        <w:rPr>
-          <w:rFonts w:ascii="Times New Roman" w:hAnsi="Times New Roman" w:cs="Times New Roman"/>
-          <w:sz w:val="22"/>
-          <w:szCs w:val="22"/>
-          <w:lang w:val="es-SV"/>
-        </w:rPr>
-        <w:t>Olist</w:t>
-      </w:r>
-      <w:proofErr w:type="spellEnd"/>
+        <w:t>Fuente: Olist</w:t>
+      </w:r>
       <w:r>
         <w:rPr>
           <w:rFonts w:ascii="Times New Roman" w:hAnsi="Times New Roman" w:cs="Times New Roman"/>
@@ -3669,23 +3550,13 @@
           <w:bCs/>
         </w:rPr>
       </w:pPr>
-      <w:proofErr w:type="gramStart"/>
       <w:r>
         <w:rPr>
           <w:rFonts w:ascii="Times New Roman" w:hAnsi="Times New Roman" w:cs="Times New Roman"/>
           <w:b/>
           <w:bCs/>
         </w:rPr>
-        <w:t>Transformación :</w:t>
-      </w:r>
-      <w:proofErr w:type="gramEnd"/>
-      <w:r>
-        <w:rPr>
-          <w:rFonts w:ascii="Times New Roman" w:hAnsi="Times New Roman" w:cs="Times New Roman"/>
-          <w:b/>
-          <w:bCs/>
-        </w:rPr>
-        <w:t xml:space="preserve"> </w:t>
+        <w:t xml:space="preserve">Transformación : </w:t>
       </w:r>
       <w:r>
         <w:rPr>
@@ -4391,17 +4262,8 @@
           <w:rFonts w:ascii="Times New Roman" w:hAnsi="Times New Roman" w:cs="Times New Roman"/>
           <w:lang w:val="es-SV"/>
         </w:rPr>
-        <w:t xml:space="preserve">Análisis de datos de </w:t>
-      </w:r>
-      <w:proofErr w:type="spellStart"/>
-      <w:r>
-        <w:rPr>
-          <w:rFonts w:ascii="Times New Roman" w:hAnsi="Times New Roman" w:cs="Times New Roman"/>
-          <w:lang w:val="es-SV"/>
-        </w:rPr>
-        <w:t>item</w:t>
-      </w:r>
-      <w:proofErr w:type="spellEnd"/>
+        <w:t>Análisis de datos de item</w:t>
+      </w:r>
     </w:p>
     <w:p>
       <w:pPr>

</xml_diff>

<commit_message>
Se suben documentos de entrega de la fase 1
</commit_message>
<xml_diff>
--- a/Documento de AnteProyecto.docx
+++ b/Documento de AnteProyecto.docx
@@ -784,39 +784,12 @@
         </w:rPr>
         <w:t xml:space="preserve"> </w:t>
       </w:r>
-      <w:hyperlink r:id="rId9" w:history="1">
-        <w:r>
-          <w:rPr>
-            <w:rStyle w:val="Hipervnculo"/>
-            <w:rFonts w:ascii="Times New Roman" w:eastAsia="Calibri" w:hAnsi="Times New Roman" w:cs="Times New Roman"/>
-            <w:sz w:val="19"/>
-            <w:szCs w:val="19"/>
-            <w:lang w:val="en-US"/>
-          </w:rPr>
-          <w:t>https://drive.google.com/file/d/18SX2iV7DoZhi5IHDXG0Q6RVhX0rqwyzr/view?usp=sharing</w:t>
-        </w:r>
-      </w:hyperlink>
-      <w:r>
-        <w:rPr>
-          <w:rFonts w:ascii="Times New Roman" w:eastAsia="Calibri" w:hAnsi="Times New Roman" w:cs="Times New Roman"/>
-          <w:sz w:val="19"/>
-          <w:szCs w:val="19"/>
+      <w:r>
+        <w:rPr>
           <w:lang w:val="en-US"/>
         </w:rPr>
-        <w:t xml:space="preserve"> </w:t>
-      </w:r>
-    </w:p>
-    <w:p>
-      <w:pPr>
-        <w:spacing w:after="80" w:line="360" w:lineRule="auto"/>
-        <w:jc w:val="center"/>
-        <w:rPr>
-          <w:rFonts w:ascii="Times New Roman" w:eastAsia="Calibri" w:hAnsi="Times New Roman" w:cs="Times New Roman"/>
-          <w:sz w:val="19"/>
-          <w:szCs w:val="19"/>
-          <w:lang w:val="en-US"/>
-        </w:rPr>
-      </w:pPr>
+        <w:t>https://github.com/EAcosta10/DMD104_G01T_2026</w:t>
+      </w:r>
     </w:p>
     <w:p>
       <w:pPr>
@@ -1894,7 +1867,7 @@
           <w:lang w:val="es-SV"/>
         </w:rPr>
         <w:sectPr>
-          <w:footerReference w:type="default" r:id="rId10"/>
+          <w:footerReference w:type="default" r:id="rId9"/>
           <w:endnotePr>
             <w:numFmt w:val="decimal"/>
           </w:endnotePr>
@@ -3289,7 +3262,7 @@
                     <pic:cNvPicPr/>
                   </pic:nvPicPr>
                   <pic:blipFill>
-                    <a:blip r:embed="rId11" cstate="print">
+                    <a:blip r:embed="rId10" cstate="print">
                       <a:extLst>
                         <a:ext uri="{28A0092B-C50C-407E-A947-70E740481C1C}">
                           <a14:useLocalDpi xmlns:a14="http://schemas.microsoft.com/office/drawing/2010/main" val="0"/>
@@ -3688,7 +3661,7 @@
                     <pic:cNvPicPr/>
                   </pic:nvPicPr>
                   <pic:blipFill>
-                    <a:blip r:embed="rId12"/>
+                    <a:blip r:embed="rId11"/>
                     <a:stretch>
                       <a:fillRect/>
                     </a:stretch>
@@ -3762,7 +3735,7 @@
                     <pic:cNvPicPr/>
                   </pic:nvPicPr>
                   <pic:blipFill>
-                    <a:blip r:embed="rId13"/>
+                    <a:blip r:embed="rId12"/>
                     <a:stretch>
                       <a:fillRect/>
                     </a:stretch>
@@ -3845,7 +3818,7 @@
                     <pic:cNvPicPr/>
                   </pic:nvPicPr>
                   <pic:blipFill>
-                    <a:blip r:embed="rId14"/>
+                    <a:blip r:embed="rId13"/>
                     <a:stretch>
                       <a:fillRect/>
                     </a:stretch>
@@ -3912,7 +3885,7 @@
                     <pic:cNvPicPr/>
                   </pic:nvPicPr>
                   <pic:blipFill>
-                    <a:blip r:embed="rId15"/>
+                    <a:blip r:embed="rId14"/>
                     <a:stretch>
                       <a:fillRect/>
                     </a:stretch>
@@ -3995,7 +3968,7 @@
                     <pic:cNvPicPr/>
                   </pic:nvPicPr>
                   <pic:blipFill>
-                    <a:blip r:embed="rId16"/>
+                    <a:blip r:embed="rId15"/>
                     <a:stretch>
                       <a:fillRect/>
                     </a:stretch>
@@ -4062,7 +4035,7 @@
                     <pic:cNvPicPr/>
                   </pic:nvPicPr>
                   <pic:blipFill>
-                    <a:blip r:embed="rId17"/>
+                    <a:blip r:embed="rId16"/>
                     <a:stretch>
                       <a:fillRect/>
                     </a:stretch>
@@ -4145,7 +4118,7 @@
                     <pic:cNvPicPr/>
                   </pic:nvPicPr>
                   <pic:blipFill>
-                    <a:blip r:embed="rId18"/>
+                    <a:blip r:embed="rId17"/>
                     <a:stretch>
                       <a:fillRect/>
                     </a:stretch>
@@ -4219,7 +4192,7 @@
                     <pic:cNvPicPr/>
                   </pic:nvPicPr>
                   <pic:blipFill>
-                    <a:blip r:embed="rId19"/>
+                    <a:blip r:embed="rId18"/>
                     <a:stretch>
                       <a:fillRect/>
                     </a:stretch>
@@ -4295,7 +4268,7 @@
                     <pic:cNvPicPr/>
                   </pic:nvPicPr>
                   <pic:blipFill>
-                    <a:blip r:embed="rId20"/>
+                    <a:blip r:embed="rId19"/>
                     <a:stretch>
                       <a:fillRect/>
                     </a:stretch>
@@ -4378,7 +4351,7 @@
                     <pic:cNvPicPr/>
                   </pic:nvPicPr>
                   <pic:blipFill>
-                    <a:blip r:embed="rId21"/>
+                    <a:blip r:embed="rId20"/>
                     <a:stretch>
                       <a:fillRect/>
                     </a:stretch>
@@ -4445,7 +4418,7 @@
                     <pic:cNvPicPr/>
                   </pic:nvPicPr>
                   <pic:blipFill>
-                    <a:blip r:embed="rId22"/>
+                    <a:blip r:embed="rId21"/>
                     <a:stretch>
                       <a:fillRect/>
                     </a:stretch>
@@ -4530,7 +4503,7 @@
                     </pic:cNvPicPr>
                   </pic:nvPicPr>
                   <pic:blipFill>
-                    <a:blip r:embed="rId23">
+                    <a:blip r:embed="rId22">
                       <a:extLst>
                         <a:ext uri="{28A0092B-C50C-407E-A947-70E740481C1C}">
                           <a14:useLocalDpi xmlns:a14="http://schemas.microsoft.com/office/drawing/2010/main" val="0"/>
@@ -4682,7 +4655,7 @@
             </w:rPr>
             <w:t xml:space="preserve">Olist Store. (s.f.). Brazilian E-Commerce Public Dataset by Olist [Conjunto de datos]. Kaggle. Obtenido de </w:t>
           </w:r>
-          <w:hyperlink r:id="rId24" w:history="1">
+          <w:hyperlink r:id="rId23" w:history="1">
             <w:r>
               <w:rPr>
                 <w:rStyle w:val="Hipervnculo"/>
@@ -4740,8 +4713,8 @@
       </w:pPr>
     </w:p>
     <w:sectPr>
-      <w:headerReference w:type="default" r:id="rId25"/>
-      <w:footerReference w:type="default" r:id="rId26"/>
+      <w:headerReference w:type="default" r:id="rId24"/>
+      <w:footerReference w:type="default" r:id="rId25"/>
       <w:endnotePr>
         <w:numFmt w:val="decimal"/>
       </w:endnotePr>

</xml_diff>